<commit_message>
Peisistratos: stummes Schaubild als A5-Blatt für den Hefter; Folien 11–12 und Handreichung angepasst
Co-Authored-By: Claude Opus 5.5 <noreply@anthropic.com>
Claude-Session: https://claude.ai/code/session_013iN4Tiarea1J9YUJHZ9iqC
</commit_message>
<xml_diff>
--- a/Geschichte_11/Stunde_Peisistratos/Handreichung_Peisistratos.docx
+++ b/Geschichte_11/Stunde_Peisistratos/Handreichung_Peisistratos.docx
@@ -710,6 +710,112 @@
           </w:p>
         </w:tc>
       </w:tr>
+      <w:tr>
+        <w:trPr>
+          <w:cantSplit/>
+        </w:trPr>
+        <w:tc>
+          <w:tcPr>
+            <w:tcW w:type="dxa" w:w="2600"/>
+            <w:tcBorders>
+              <w:top w:val="single" w:color="BFB5A5" w:sz="4"/>
+              <w:left w:val="single" w:color="BFB5A5" w:sz="4"/>
+              <w:bottom w:val="single" w:color="BFB5A5" w:sz="4"/>
+              <w:right w:val="single" w:color="BFB5A5" w:sz="4"/>
+            </w:tcBorders>
+            <w:tcMar>
+              <w:top w:type="dxa" w:w="70"/>
+              <w:left w:type="dxa" w:w="100"/>
+              <w:bottom w:type="dxa" w:w="70"/>
+              <w:right w:type="dxa" w:w="100"/>
+            </w:tcMar>
+          </w:tcPr>
+          <w:p>
+            <w:pPr>
+              <w:spacing w:after="30" w:before="0"/>
+            </w:pPr>
+            <w:r>
+              <w:rPr>
+                <w:b/>
+                <w:bCs/>
+                <w:sz w:val="18"/>
+                <w:szCs w:val="18"/>
+              </w:rPr>
+              <w:t xml:space="preserve">Stummes Schaubild</w:t>
+            </w:r>
+          </w:p>
+          <w:p>
+            <w:pPr>
+              <w:spacing w:after="30" w:before="0"/>
+            </w:pPr>
+            <w:r>
+              <w:rPr>
+                <w:sz w:val="18"/>
+                <w:szCs w:val="18"/>
+              </w:rPr>
+              <w:t xml:space="preserve">Stummes_Schaubild_A5.docx</w:t>
+            </w:r>
+          </w:p>
+        </w:tc>
+        <w:tc>
+          <w:tcPr>
+            <w:tcW w:type="dxa" w:w="1900"/>
+            <w:tcBorders>
+              <w:top w:val="single" w:color="BFB5A5" w:sz="4"/>
+              <w:left w:val="single" w:color="BFB5A5" w:sz="4"/>
+              <w:bottom w:val="single" w:color="BFB5A5" w:sz="4"/>
+              <w:right w:val="single" w:color="BFB5A5" w:sz="4"/>
+            </w:tcBorders>
+            <w:tcMar>
+              <w:top w:type="dxa" w:w="70"/>
+              <w:left w:type="dxa" w:w="100"/>
+              <w:bottom w:type="dxa" w:w="70"/>
+              <w:right w:type="dxa" w:w="100"/>
+            </w:tcMar>
+          </w:tcPr>
+          <w:p>
+            <w:pPr>
+              <w:spacing w:after="0" w:before="0"/>
+            </w:pPr>
+            <w:r>
+              <w:rPr>
+                <w:sz w:val="18"/>
+                <w:szCs w:val="18"/>
+              </w:rPr>
+              <w:t xml:space="preserve">halb so viele Blätter wie Schüler</w:t>
+            </w:r>
+          </w:p>
+        </w:tc>
+        <w:tc>
+          <w:tcPr>
+            <w:tcW w:type="dxa" w:w="5138"/>
+            <w:tcBorders>
+              <w:top w:val="single" w:color="BFB5A5" w:sz="4"/>
+              <w:left w:val="single" w:color="BFB5A5" w:sz="4"/>
+              <w:bottom w:val="single" w:color="BFB5A5" w:sz="4"/>
+              <w:right w:val="single" w:color="BFB5A5" w:sz="4"/>
+            </w:tcBorders>
+            <w:tcMar>
+              <w:top w:type="dxa" w:w="70"/>
+              <w:left w:type="dxa" w:w="100"/>
+              <w:bottom w:type="dxa" w:w="70"/>
+              <w:right w:type="dxa" w:w="100"/>
+            </w:tcMar>
+          </w:tcPr>
+          <w:p>
+            <w:pPr>
+              <w:spacing w:after="0" w:before="0"/>
+            </w:pPr>
+            <w:r>
+              <w:rPr>
+                <w:sz w:val="18"/>
+                <w:szCs w:val="18"/>
+              </w:rPr>
+              <w:t xml:space="preserve">A4 quer, 2 Exemplare pro Blatt, in der Mitte schneiden. Kommt danach in den Hefter.</w:t>
+            </w:r>
+          </w:p>
+        </w:tc>
+      </w:tr>
     </w:tbl>
     <w:p>
       <w:pPr>
@@ -720,7 +826,7 @@
           <w:sz w:val="18"/>
           <w:szCs w:val="18"/>
         </w:rPr>
-        <w:t xml:space="preserve">Sonst nichts: Ergebnisse ins Heft, Ausgangskarte auf einen Zettel.</w:t>
+        <w:t xml:space="preserve">Alles andere: Ergebnisse ins Heft, Ausgangskarte auf einen Zettel.</w:t>
       </w:r>
     </w:p>
     <w:p>
@@ -2290,7 +2396,7 @@
                 <w:sz w:val="18"/>
                 <w:szCs w:val="18"/>
               </w:rPr>
-              <w:t xml:space="preserve">Buch und Hefter zu, Karten abdecken. Leeres Gerüst an die Tafel, gemeinsam füllen, Fragen klären, in den Hefter übertragen.</w:t>
+              <w:t xml:space="preserve">Buch und Hefter zu, Karten abdecken. Blatt austeilen, dasselbe Gerüst an die Tafel zeichnen und gemeinsam füllen – jeder schreibt auf seinem Blatt mit. Fragen klären, Blatt in den Hefter.</w:t>
             </w:r>
           </w:p>
         </w:tc>
@@ -5040,7 +5146,7 @@
           <w:sz w:val="19"/>
           <w:szCs w:val="19"/>
         </w:rPr>
-        <w:t xml:space="preserve"> (in ca. 1 Minute an die Tafel zeichnen: Mitte, vier Felder, je ein Pfeil hin und zurück):</w:t>
+        <w:t xml:space="preserve"> (dasselbe Gerüst wie auf dem Blatt; in ca. 1 Minute an die Tafel zeichnen: Mitte, vier Felder, je ein Pfeil hin und zurück):</w:t>
       </w:r>
     </w:p>
     <w:p>

</xml_diff>

<commit_message>
Peisistratos: A4-Arbeitsblatt mit Teil A (Text, Personenkarte) und Teil B (Schaubild); Folien und Handreichung angepasst
Co-Authored-By: Claude Opus 5.5 <noreply@anthropic.com>
Claude-Session: https://claude.ai/code/session_013iN4Tiarea1J9YUJHZ9iqC
</commit_message>
<xml_diff>
--- a/Geschichte_11/Stunde_Peisistratos/Handreichung_Peisistratos.docx
+++ b/Geschichte_11/Stunde_Peisistratos/Handreichung_Peisistratos.docx
@@ -741,7 +741,7 @@
                 <w:sz w:val="18"/>
                 <w:szCs w:val="18"/>
               </w:rPr>
-              <w:t xml:space="preserve">Stummes Schaubild</w:t>
+              <w:t xml:space="preserve">Arbeitsblatt</w:t>
             </w:r>
           </w:p>
           <w:p>
@@ -753,7 +753,7 @@
                 <w:sz w:val="18"/>
                 <w:szCs w:val="18"/>
               </w:rPr>
-              <w:t xml:space="preserve">Stummes_Schaubild_A5.docx</w:t>
+              <w:t xml:space="preserve">Arbeitsblatt_Peisistratos_A4.docx</w:t>
             </w:r>
           </w:p>
         </w:tc>
@@ -782,7 +782,7 @@
                 <w:sz w:val="18"/>
                 <w:szCs w:val="18"/>
               </w:rPr>
-              <w:t xml:space="preserve">halb so viele Blätter wie Schüler</w:t>
+              <w:t xml:space="preserve">1 pro Schüler</w:t>
             </w:r>
           </w:p>
         </w:tc>
@@ -811,7 +811,7 @@
                 <w:sz w:val="18"/>
                 <w:szCs w:val="18"/>
               </w:rPr>
-              <w:t xml:space="preserve">A4 quer, 2 Exemplare pro Blatt, in der Mitte schneiden. Kommt danach in den Hefter.</w:t>
+              <w:t xml:space="preserve">A4 hoch. Teil A: Buchtext und Antworten zur Personenkarte. Teil B: stummes Schaubild (erst nach dem Tafel-Puzzle). Kommt in den Hefter.</w:t>
             </w:r>
           </w:p>
         </w:tc>
@@ -826,7 +826,7 @@
           <w:sz w:val="18"/>
           <w:szCs w:val="18"/>
         </w:rPr>
-        <w:t xml:space="preserve">Alles andere: Ergebnisse ins Heft, Ausgangskarte auf einen Zettel.</w:t>
+        <w:t xml:space="preserve">Ausgangskarte auf einen Zettel.</w:t>
       </w:r>
     </w:p>
     <w:p>
@@ -1792,7 +1792,7 @@
                 <w:sz w:val="18"/>
                 <w:szCs w:val="18"/>
               </w:rPr>
-              <w:t xml:space="preserve">8 Paare, je eine Karte. Buchtext an der Wand, Feld bestimmen, zwei Sätze ins Heft. Du gehst herum.</w:t>
+              <w:t xml:space="preserve">Arbeitsblatt austeilen. 8 Paare, je eine Karte. Buchtext auf dem Blatt (und an der Wand), Feld bestimmen, Antworten in Teil A. Du gehst herum.</w:t>
             </w:r>
           </w:p>
         </w:tc>
@@ -2396,7 +2396,7 @@
                 <w:sz w:val="18"/>
                 <w:szCs w:val="18"/>
               </w:rPr>
-              <w:t xml:space="preserve">Buch und Hefter zu, Karten abdecken. Blatt austeilen, dasselbe Gerüst an die Tafel zeichnen und gemeinsam füllen – jeder schreibt auf seinem Blatt mit. Fragen klären, Blatt in den Hefter.</w:t>
+              <w:t xml:space="preserve">Karten an der Tafel abdecken. Dasselbe Gerüst an die Tafel zeichnen und gemeinsam füllen – jeder schreibt in Teil B auf seinem Blatt mit. Fragen klären, Blatt in den Hefter.</w:t>
             </w:r>
           </w:p>
         </w:tc>
@@ -5146,7 +5146,7 @@
           <w:sz w:val="19"/>
           <w:szCs w:val="19"/>
         </w:rPr>
-        <w:t xml:space="preserve"> (dasselbe Gerüst wie auf dem Blatt; in ca. 1 Minute an die Tafel zeichnen: Mitte, vier Felder, je ein Pfeil hin und zurück):</w:t>
+        <w:t xml:space="preserve"> (dasselbe Gerüst wie in Teil B des Arbeitsblatts; in ca. 1 Minute an die Tafel zeichnen: Mitte, vier Felder, je ein Pfeil hin und zurück):</w:t>
       </w:r>
     </w:p>
     <w:p>

</xml_diff>